<commit_message>
court(iowa): discretionary review contents on the caption page, regenerated, still report (fb-595.54.44)
Co-Authored-By: Claude Opus 5.5 <noreply@anthropic.com>
</commit_message>
<xml_diff>
--- a/courts/eighth-circuit/iowa/state/supreme-court/petition-for-discretionary-review/usage/OUTPUT-petition-for-discretionary-review.docx
+++ b/courts/eighth-circuit/iowa/state/supreme-court/petition-for-discretionary-review/usage/OUTPUT-petition-for-discretionary-review.docx
@@ -608,15 +608,9 @@
     </w:p>
     <w:p>
       <w:pPr>
-        <w:pageBreakBefore/>
-        <w:spacing w:before="0" w:after="0" w:line="1" w:lineRule="exact"/>
-      </w:pPr>
-    </w:p>
-    <w:p>
-      <w:pPr>
         <w:keepNext/>
         <w:keepLines/>
-        <w:spacing w:before="0" w:after="280" w:line="322" w:lineRule="exact"/>
+        <w:spacing w:before="336" w:after="280" w:line="322" w:lineRule="exact"/>
         <w:ind w:left="0" w:firstLine="0"/>
         <w:jc w:val="center"/>
       </w:pPr>
@@ -1580,7 +1574,7 @@
         <w:t xml:space="preserve">e.g.</w:t>
       </w:r>
       <w:r>
-        <w:t xml:space="preserve">, Dkt. 22 at 9 (finding PPH 2022 “bound” application of undue burden) and Dkt. 2 at 2 (same) with Dkt. 22 at 9 (finding the State’s contention that “the Iowa Supreme Court has not independently adopted the undue burden standard . . . may be a valid argument”) and Dkt. 19 at 20 (contending this Court has not independently adopted the</w:t>
+        <w:t xml:space="preserve">, Dkt. 22 at 9 (finding PPH 2022 “bound” application of undue burden) and Dkt. 2 at 2 (same) with Dkt. 22 at 9 (finding the State’s contention that “the Iowa Supreme Court has not independently adopted the undue burden standard . . . may be a valid argument”) and Dkt. 19 at 20 (contending this Court has not independently adopted the</w:t>
       </w:r>
       <w:r>
         <w:t xml:space="preserve"> </w:t>
@@ -3486,7 +3480,7 @@
         <w:pStyle w:val="BodyText"/>
       </w:pPr>
       <w:r>
-        <w:t xml:space="preserve">Here, Plaintiffs include Planned Parenthood of the Heartlands, Inc., a nonprofit corporation that provides abortions in Iowa, Dr. Sarah Traxler, the medical director for PPH and an abortion provider, and the Emma Goldman Clinic, an abortion clinic in Iowa City. See Dkt. 1 ¶¶ 10–16. Each Plaintiff sues on its own behalf and on behalf of patients, and the two organizations sue on behalf of their “medical providers and other staff.” Dkt. 1 ¶¶ 12–13, 16.</w:t>
+        <w:t xml:space="preserve">Here, Plaintiffs include Planned Parenthood of the Heartlands, Inc., a nonprofit corporation that provides abortions in Iowa, Dr. Sarah Traxler, the medical director for PPH and an abortion provider, and the Emma Goldman Clinic, an abortion clinic in Iowa City. See Dkt. 1 ¶¶ 10–⁠16. Each Plaintiff sues on its own behalf and on behalf of patients, and the two organizations sue on behalf of their “medical providers and other staff.” Dkt. 1 ¶¶ 12–⁠13, 16.</w:t>
       </w:r>
     </w:p>
     <w:p>
@@ -3736,7 +3730,7 @@
         <w:pStyle w:val="BodyText"/>
       </w:pPr>
       <w:r>
-        <w:t xml:space="preserve">Abortion providers here cannot satisfy standing because they are not asserting their own constitutional rights or their own injury. Indeed, while Plaintiffs contend they sue on their own behalf, Dkt. 1 ¶¶ 12–13, 16, they cannot be asserting their own protected rights because the Iowa Supreme Court has explicitly held that there is no right to provide an abortion. PPH 2021, 962 N.W.2d at 44. Plaintiffs are also suing on behalf of women that they contend will have their rights affected by the Fetal Heartbeat Statute. Dkt. 1, ¶¶ 12–13, 16. But after PPH 2022, it is unclear what derivative rights Plaintiffs contend they are asserting.</w:t>
+        <w:t xml:space="preserve">Abortion providers here cannot satisfy standing because they are not asserting their own constitutional rights or their own injury. Indeed, while Plaintiffs contend they sue on their own behalf, Dkt. 1 ¶¶ 12–⁠13, 16, they cannot be asserting their own protected rights because the Iowa Supreme Court has explicitly held that there is no right to provide an abortion. PPH 2021, 962 N.W.2d at 44. Plaintiffs are also suing on behalf of women that they contend will have their rights affected by the Fetal Heartbeat Statute. Dkt. 1, ¶¶ 12–⁠13, 16. But after PPH 2022, it is unclear what derivative rights Plaintiffs contend they are asserting.</w:t>
       </w:r>
     </w:p>
     <w:p>
@@ -3820,7 +3814,7 @@
         <w:pStyle w:val="BodyText"/>
       </w:pPr>
       <w:r>
-        <w:t xml:space="preserve">The Plaintiff Abortion Providers assert that having to turn away patients will affect their livelihoods. Dkt. 2, Brief in Support at *19–20. That evidence cannot carry Plaintiffs’ burden to show irreparable harm. An injunction is an extraordinary remedy to be granted only if the “requesting party . . . will incur irreparable damage.”</w:t>
+        <w:t xml:space="preserve">The Plaintiff Abortion Providers assert that having to turn away patients will affect their livelihoods. Dkt. 2, Brief in Support at *19–20. That evidence cannot carry Plaintiffs’ burden to show irreparable harm. An injunction is an extraordinary remedy to be granted only if the “requesting party . . . will incur irreparable damage.”</w:t>
       </w:r>
       <w:r>
         <w:t xml:space="preserve"> </w:t>
@@ -5482,6 +5476,33 @@
     <w:pPr>
       <w:spacing w:before="0" w:after="0" w:line="644" w:lineRule="exact"/>
       <w:ind w:left="2160" w:hanging="720"/>
+    </w:pPr>
+  </w:style>
+  <w:style w:type="paragraph" w:customStyle="1" w:styleId="XdQuoteList1">
+    <w:name w:val="Xd Quote List 1"/>
+    <w:basedOn w:val="Normal"/>
+    <w:qFormat/>
+    <w:pPr>
+      <w:spacing w:before="0" w:after="0" w:line="322" w:lineRule="exact"/>
+      <w:ind w:left="1440" w:right="720" w:hanging="720"/>
+    </w:pPr>
+  </w:style>
+  <w:style w:type="paragraph" w:customStyle="1" w:styleId="XdQuoteList2">
+    <w:name w:val="Xd Quote List 2"/>
+    <w:basedOn w:val="Normal"/>
+    <w:qFormat/>
+    <w:pPr>
+      <w:spacing w:before="0" w:after="0" w:line="322" w:lineRule="exact"/>
+      <w:ind w:left="2160" w:right="720" w:hanging="720"/>
+    </w:pPr>
+  </w:style>
+  <w:style w:type="paragraph" w:customStyle="1" w:styleId="XdQuoteList3">
+    <w:name w:val="Xd Quote List 3"/>
+    <w:basedOn w:val="Normal"/>
+    <w:qFormat/>
+    <w:pPr>
+      <w:spacing w:before="0" w:after="0" w:line="322" w:lineRule="exact"/>
+      <w:ind w:left="2880" w:right="720" w:hanging="720"/>
     </w:pPr>
   </w:style>
   <w:style w:type="paragraph" w:customStyle="1" w:styleId="XdTail">

</xml_diff>

<commit_message>
court(iowa): petition-for-discretionary-review docx_bias 0.05 (measured: 0.1 fits less on p18), cross_engine gate (fb-595.54.44)
Co-Authored-By: Claude Opus 5.5 <noreply@anthropic.com>
</commit_message>
<xml_diff>
--- a/courts/eighth-circuit/iowa/state/supreme-court/petition-for-discretionary-review/usage/OUTPUT-petition-for-discretionary-review.docx
+++ b/courts/eighth-circuit/iowa/state/supreme-court/petition-for-discretionary-review/usage/OUTPUT-petition-for-discretionary-review.docx
@@ -93,7 +93,7 @@
     </w:p>
     <w:tbl>
       <w:tblPr>
-        <w:tblW w:w="9360" w:type="dxa"/>
+        <w:tblW w:w="9359" w:type="dxa"/>
         <w:tblLayout w:type="fixed"/>
         <w:tblCellMar>
           <w:top w:w="0" w:type="dxa"/>
@@ -104,7 +104,7 @@
         <w:tblLook w:val="0000" w:firstRow="0" w:lastRow="0" w:firstColumn="0" w:lastColumn="0" w:noHBand="0" w:noVBand="0"/>
       </w:tblPr>
       <w:tblGrid>
-        <w:gridCol w:w="4536"/>
+        <w:gridCol w:w="4535"/>
         <w:gridCol w:w="4824"/>
       </w:tblGrid>
       <w:tr>
@@ -113,7 +113,7 @@
         </w:trPr>
         <w:tc>
           <w:tcPr>
-            <w:tcW w:w="4536" w:type="dxa"/>
+            <w:tcW w:w="4535" w:type="dxa"/>
           </w:tcPr>
           <w:p>
             <w:pPr>
@@ -654,7 +654,7 @@
       <w:pPr>
         <w:keepLines/>
         <w:tabs>
-          <w:tab w:val="right" w:leader="dot" w:pos="9360"/>
+          <w:tab w:val="right" w:leader="dot" w:pos="9359"/>
         </w:tabs>
         <w:spacing w:before="196" w:after="0" w:line="322" w:lineRule="exact"/>
         <w:ind w:left="0" w:right="720" w:firstLine="0"/>
@@ -676,7 +676,7 @@
       <w:pPr>
         <w:keepLines/>
         <w:tabs>
-          <w:tab w:val="right" w:leader="dot" w:pos="9360"/>
+          <w:tab w:val="right" w:leader="dot" w:pos="9359"/>
         </w:tabs>
         <w:spacing w:before="196" w:after="0" w:line="322" w:lineRule="exact"/>
         <w:ind w:left="0" w:right="720" w:firstLine="0"/>
@@ -698,7 +698,7 @@
       <w:pPr>
         <w:keepLines/>
         <w:tabs>
-          <w:tab w:val="right" w:leader="dot" w:pos="9360"/>
+          <w:tab w:val="right" w:leader="dot" w:pos="9359"/>
         </w:tabs>
         <w:spacing w:before="196" w:after="0" w:line="322" w:lineRule="exact"/>
         <w:ind w:left="280" w:right="720" w:firstLine="0"/>
@@ -732,7 +732,7 @@
       <w:pPr>
         <w:keepLines/>
         <w:tabs>
-          <w:tab w:val="right" w:leader="dot" w:pos="9360"/>
+          <w:tab w:val="right" w:leader="dot" w:pos="9359"/>
         </w:tabs>
         <w:spacing w:before="196" w:after="0" w:line="322" w:lineRule="exact"/>
         <w:ind w:left="280" w:right="720" w:firstLine="0"/>
@@ -766,7 +766,7 @@
       <w:pPr>
         <w:keepLines/>
         <w:tabs>
-          <w:tab w:val="right" w:leader="dot" w:pos="9360"/>
+          <w:tab w:val="right" w:leader="dot" w:pos="9359"/>
         </w:tabs>
         <w:spacing w:before="196" w:after="0" w:line="322" w:lineRule="exact"/>
         <w:ind w:left="0" w:right="720" w:firstLine="0"/>
@@ -788,7 +788,7 @@
       <w:pPr>
         <w:keepLines/>
         <w:tabs>
-          <w:tab w:val="right" w:leader="dot" w:pos="9360"/>
+          <w:tab w:val="right" w:leader="dot" w:pos="9359"/>
         </w:tabs>
         <w:spacing w:before="196" w:after="0" w:line="322" w:lineRule="exact"/>
         <w:ind w:left="280" w:right="720" w:firstLine="0"/>
@@ -888,7 +888,7 @@
       <w:pPr>
         <w:keepLines/>
         <w:tabs>
-          <w:tab w:val="right" w:leader="dot" w:pos="9360"/>
+          <w:tab w:val="right" w:leader="dot" w:pos="9359"/>
         </w:tabs>
         <w:spacing w:before="196" w:after="0" w:line="322" w:lineRule="exact"/>
         <w:ind w:left="280" w:right="720" w:firstLine="0"/>
@@ -1066,7 +1066,7 @@
       <w:pPr>
         <w:keepLines/>
         <w:tabs>
-          <w:tab w:val="right" w:leader="dot" w:pos="9360"/>
+          <w:tab w:val="right" w:leader="dot" w:pos="9359"/>
         </w:tabs>
         <w:spacing w:before="196" w:after="0" w:line="322" w:lineRule="exact"/>
         <w:ind w:left="280" w:right="720" w:firstLine="0"/>
@@ -1172,7 +1172,7 @@
       <w:pPr>
         <w:keepLines/>
         <w:tabs>
-          <w:tab w:val="right" w:leader="dot" w:pos="9360"/>
+          <w:tab w:val="right" w:leader="dot" w:pos="9359"/>
         </w:tabs>
         <w:spacing w:before="196" w:after="0" w:line="322" w:lineRule="exact"/>
         <w:ind w:left="280" w:right="720" w:firstLine="0"/>
@@ -1242,7 +1242,7 @@
       <w:pPr>
         <w:keepLines/>
         <w:tabs>
-          <w:tab w:val="right" w:leader="dot" w:pos="9360"/>
+          <w:tab w:val="right" w:leader="dot" w:pos="9359"/>
         </w:tabs>
         <w:spacing w:before="196" w:after="0" w:line="322" w:lineRule="exact"/>
         <w:ind w:left="0" w:right="720" w:firstLine="0"/>
@@ -1264,7 +1264,7 @@
       <w:pPr>
         <w:keepLines/>
         <w:tabs>
-          <w:tab w:val="right" w:leader="dot" w:pos="9360"/>
+          <w:tab w:val="right" w:leader="dot" w:pos="9359"/>
         </w:tabs>
         <w:spacing w:before="196" w:after="0" w:line="322" w:lineRule="exact"/>
         <w:ind w:left="0" w:right="720" w:firstLine="0"/>
@@ -3869,7 +3869,7 @@
     </w:p>
     <w:tbl>
       <w:tblPr>
-        <w:tblW w:w="9360" w:type="dxa"/>
+        <w:tblW w:w="9359" w:type="dxa"/>
         <w:tblLayout w:type="fixed"/>
         <w:tblCellMar>
           <w:top w:w="0" w:type="dxa"/>
@@ -3880,7 +3880,7 @@
         <w:tblLook w:val="0000" w:firstRow="0" w:lastRow="0" w:firstColumn="0" w:lastColumn="0" w:noHBand="0" w:noVBand="0"/>
       </w:tblPr>
       <w:tblGrid>
-        <w:gridCol w:w="9360"/>
+        <w:gridCol w:w="9359"/>
       </w:tblGrid>
       <w:tr>
         <w:trPr>
@@ -3888,7 +3888,7 @@
         </w:trPr>
         <w:tc>
           <w:tcPr>
-            <w:tcW w:w="9360" w:type="dxa"/>
+            <w:tcW w:w="9359" w:type="dxa"/>
           </w:tcPr>
           <w:p>
             <w:pPr>
@@ -4397,7 +4397,7 @@
     <w:sectPr>
       <w:footerReference w:type="default" r:id="rIdXdPage"/>
       <w:pgSz w:w="12240" w:h="15840"/>
-      <w:pgMar w:top="1440" w:right="1440" w:bottom="1440" w:left="1440" w:header="720" w:footer="686" w:gutter="0"/>
+      <w:pgMar w:top="1440" w:right="1441" w:bottom="1440" w:left="1440" w:header="720" w:footer="686" w:gutter="0"/>
     </w:sectPr>
   </w:body>
 </w:document>

</xml_diff>